<commit_message>
feat(c06): aplicare set texte rafinate (FILM -> 4 machete, round-trip PASS)
FILM C06 (sursa): INTRIGA, MIZA, WOW, MOTTO + exec-phrase S2-S6 actualizate.
Propagat in machete:
- MOTTO "Un profil cunoscut. Apoi orice decizie." (4 machete)
- INTRIGA cover-subtitle + 4 propozitie (studiu + editor-studiu)
- MIZA red-box randat in voce studiu "Nu mai decidem pe impresii" (studiu x2)
- WOW payoff/accent "Pentru prima data, setul are dimensiune, centru si margini" (4)
- exec-phrase S2-S6 (video + editor-video)

Round-trip exec-phrase FILM<->Video: PASS. audit_sync 60/60 ZERO DRIFT.

https://claude.ai/code/session_011hdPJf3hrU8AgLAMEvh9c2
</commit_message>
<xml_diff>
--- a/c06/FILM-Excel-06-Cuantificare.docx
+++ b/c06/FILM-Excel-06-Cuantificare.docx
@@ -68,7 +68,7 @@
           <w:rFonts w:ascii="Calibri" w:hAnsi="Calibri"/>
           <w:sz w:val="20"/>
         </w:rPr>
-        <w:t>Setul are cifre. Excel le stie. Tu nu. Acum il intrebam cat de mare e.</w:t>
+        <w:t>Setul are cifre. Excel le știe. Tu nu. Acum îi descoperim dimensiunea.</w:t>
       </w:r>
     </w:p>
     <w:p>
@@ -92,7 +92,7 @@
           <w:rFonts w:ascii="Calibri" w:hAnsi="Calibri"/>
           <w:sz w:val="20"/>
         </w:rPr>
-        <w:t>C05 a clasificat etichetele setului. C06 face profilul CANTITATIV: suma totala si pe categorie, media si mediana per factura, amplitudinea minim-maxim, dispersia cu STDEV si concentrarea valorii pe categorii.</w:t>
+        <w:t>Operatorul iese cu profilul numeric real al setului. Nu mai lucrează pe impresii.</w:t>
       </w:r>
     </w:p>
     <w:p>
@@ -140,7 +140,7 @@
           <w:rFonts w:ascii="Calibri" w:hAnsi="Calibri"/>
           <w:sz w:val="20"/>
         </w:rPr>
-        <w:t>Profil numeric complet: suma, medie, mediana, amplitudine, dispersie, concentrare. Setul are dimensiune, centru si margini.</w:t>
+        <w:t>Pentru prima dată, setul are dimensiune, centru și margini.</w:t>
       </w:r>
     </w:p>
     <w:p>
@@ -164,7 +164,7 @@
           <w:rFonts w:ascii="Calibri" w:hAnsi="Calibri"/>
           <w:sz w:val="20"/>
         </w:rPr>
-        <w:t>O cifră cunoscută. Apoi orice decizie.</w:t>
+        <w:t>Un profil cunoscut. Apoi orice decizie.</w:t>
       </w:r>
     </w:p>
     <w:p>
@@ -279,7 +279,7 @@
           <w:b w:val="0"/>
           <w:sz w:val="20"/>
         </w:rPr>
-        <w:t>AI-ul nu calculează în locul tău. AI-ul scoate la suprafață cifrele pe care nu le-ai cerut.</w:t>
+        <w:t>Setul răspunde. Dacă știi ce să întrebi.</w:t>
       </w:r>
     </w:p>
     <w:p>
@@ -327,7 +327,7 @@
           <w:b w:val="0"/>
           <w:sz w:val="20"/>
         </w:rPr>
-        <w:t>Nu am schimbat nicio valoare. Am scos la lumină suma, media și marginile setului.</w:t>
+        <w:t>Nu am modificat setul. I-am aflat dimensiunea.</w:t>
       </w:r>
     </w:p>
     <w:p>
@@ -375,7 +375,7 @@
           <w:b w:val="0"/>
           <w:sz w:val="20"/>
         </w:rPr>
-        <w:t>O cifră raportată nu este o cifră confirmată. SUM și MEDIAN decid.</w:t>
+        <w:t>O cifră spusă poate fi greșită. O cifră verificată devine realitate.</w:t>
       </w:r>
     </w:p>
     <w:p>
@@ -423,7 +423,7 @@
           <w:b w:val="0"/>
           <w:sz w:val="20"/>
         </w:rPr>
-        <w:t>Un profil corect azi se abate luna viitoare. Dacă nu rămâne legat la suma sursei.</w:t>
+        <w:t>Astăzi e profil. Mâine trebuie să fie rutină.</w:t>
       </w:r>
     </w:p>
     <w:p>
@@ -471,7 +471,7 @@
           <w:b w:val="0"/>
           <w:sz w:val="20"/>
         </w:rPr>
-        <w:t>Era o listă de numere. De data asta, are dimensiune, centru și margini.</w:t>
+        <w:t>Era o listă de numere. Acum are dimensiune, centru și margini.</w:t>
       </w:r>
     </w:p>
     <w:p>

</xml_diff>